<commit_message>
vegan and readxl package
</commit_message>
<xml_diff>
--- a/Sediment_summary.docx
+++ b/Sediment_summary.docx
@@ -19,8 +19,11 @@
     </w:p>
     <w:p>
       <w:r>
+        <w:rPr>
+          <w:noProof/>
+        </w:rPr>
         <w:drawing>
-          <wp:anchor distT="0" distB="0" distL="114300" distR="114300" simplePos="0" relativeHeight="251658240" behindDoc="0" locked="0" layoutInCell="1" allowOverlap="1" wp14:anchorId="6EB4C345" wp14:editId="25FE8EDA">
+          <wp:anchor distT="0" distB="0" distL="114300" distR="114300" simplePos="0" relativeHeight="251658240" behindDoc="0" locked="0" layoutInCell="1" allowOverlap="1" wp14:anchorId="6EB4C345" wp14:editId="7EDB8490">
             <wp:simplePos x="0" y="0"/>
             <wp:positionH relativeFrom="column">
               <wp:posOffset>0</wp:posOffset>
@@ -132,16 +135,7 @@
         <w:t xml:space="preserve">No significant difference </w:t>
       </w:r>
       <w:r>
-        <w:t xml:space="preserve">between </w:t>
-      </w:r>
-      <w:r>
-        <w:t>treatment</w:t>
-      </w:r>
-      <w:r>
-        <w:t xml:space="preserve"> types</w:t>
-      </w:r>
-      <w:r>
-        <w:t xml:space="preserve"> </w:t>
+        <w:t xml:space="preserve">between treatment types </w:t>
       </w:r>
       <w:r>
         <w:t xml:space="preserve">for </w:t>
@@ -162,14 +156,14 @@
         <w:t xml:space="preserve">to </w:t>
       </w:r>
       <w:r>
-        <w:t>2mm</w:t>
-      </w:r>
-      <w:r>
-        <w:t xml:space="preserve">. See below. </w:t>
+        <w:t xml:space="preserve">2mm. See below. </w:t>
       </w:r>
     </w:p>
     <w:p>
       <w:r>
+        <w:rPr>
+          <w:noProof/>
+        </w:rPr>
         <w:drawing>
           <wp:inline distT="0" distB="0" distL="0" distR="0" wp14:anchorId="781440F6" wp14:editId="477D3E3E">
             <wp:extent cx="3720860" cy="3045461"/>
@@ -230,6 +224,9 @@
     </w:p>
     <w:p>
       <w:r>
+        <w:rPr>
+          <w:noProof/>
+        </w:rPr>
         <w:drawing>
           <wp:inline distT="0" distB="0" distL="0" distR="0" wp14:anchorId="25A688C3" wp14:editId="50A3DDAB">
             <wp:extent cx="3632620" cy="2973238"/>
@@ -274,6 +271,9 @@
     </w:p>
     <w:p>
       <w:r>
+        <w:rPr>
+          <w:noProof/>
+        </w:rPr>
         <w:drawing>
           <wp:inline distT="0" distB="0" distL="0" distR="0" wp14:anchorId="41A7809C" wp14:editId="390CEDF0">
             <wp:extent cx="3997990" cy="3272287"/>
@@ -353,6 +353,9 @@
     </w:p>
     <w:p>
       <w:r>
+        <w:rPr>
+          <w:noProof/>
+        </w:rPr>
         <w:drawing>
           <wp:inline distT="0" distB="0" distL="0" distR="0" wp14:anchorId="46FC7BD0" wp14:editId="6F9EF172">
             <wp:extent cx="3439064" cy="2814815"/>
@@ -397,6 +400,9 @@
     </w:p>
     <w:p>
       <w:r>
+        <w:rPr>
+          <w:noProof/>
+        </w:rPr>
         <w:drawing>
           <wp:inline distT="0" distB="0" distL="0" distR="0" wp14:anchorId="2AEA151C" wp14:editId="34986F4F">
             <wp:extent cx="3028355" cy="2478657"/>
@@ -442,10 +448,7 @@
     <w:p>
       <w:r>
         <w:lastRenderedPageBreak/>
-        <w:t xml:space="preserve">No significant difference between treatments for total inorganic carbon </w:t>
-      </w:r>
-      <w:r>
-        <w:t>CaCO</w:t>
+        <w:t>No significant difference between treatments for CaCO</w:t>
       </w:r>
       <w:r>
         <w:rPr>
@@ -459,6 +462,9 @@
     </w:p>
     <w:p>
       <w:r>
+        <w:rPr>
+          <w:noProof/>
+        </w:rPr>
         <w:drawing>
           <wp:inline distT="0" distB="0" distL="0" distR="0" wp14:anchorId="3401FB56" wp14:editId="00AA1E95">
             <wp:extent cx="3211040" cy="2628181"/>
@@ -498,18 +504,15 @@
     </w:p>
     <w:p>
       <w:r>
-        <w:t xml:space="preserve">No significant difference between treatments for total </w:t>
-      </w:r>
-      <w:r>
-        <w:t>nitrogen N</w:t>
-      </w:r>
-      <w:r>
-        <w:t>. See below.</w:t>
+        <w:t>No significant difference between treatments for total nitrogen N. See below.</w:t>
       </w:r>
     </w:p>
     <w:p/>
     <w:p>
       <w:r>
+        <w:rPr>
+          <w:noProof/>
+        </w:rPr>
         <w:drawing>
           <wp:inline distT="0" distB="0" distL="0" distR="0" wp14:anchorId="026D4F98" wp14:editId="42303FD3">
             <wp:extent cx="3324045" cy="2849232"/>

</xml_diff>